<commit_message>
Add PDF and update referentielijst DOCX
Added a PDF export and updated the DOCX source for docs/Official/25-26_GDC_Referentielijst_Ian_6ICWE. Includes the new printable PDF alongside the revised Word document for the 25-26 GDC Referentielijst (Ian, 6ICWE).
</commit_message>
<xml_diff>
--- a/docs/Official/25-26_GDC_Referentielijst_Ian_6ICWE.docx
+++ b/docs/Official/25-26_GDC_Referentielijst_Ian_6ICWE.docx
@@ -1396,23 +1396,7 @@
           <w:i/>
           <w:iCs/>
         </w:rPr>
-        <w:t xml:space="preserve">Cross Site Request </w:t>
-      </w:r>
-      <w:proofErr w:type="spellStart"/>
-      <w:r>
-        <w:rPr>
-          <w:i/>
-          <w:iCs/>
-        </w:rPr>
-        <w:t>Forgery</w:t>
-      </w:r>
-      <w:proofErr w:type="spellEnd"/>
-      <w:r>
-        <w:rPr>
-          <w:i/>
-          <w:iCs/>
-        </w:rPr>
-        <w:t xml:space="preserve"> (CSRF) | OWASP Foundation</w:t>
+        <w:t>Cross Site Request Forgery (CSRF) | OWASP Foundation</w:t>
       </w:r>
       <w:r>
         <w:t>. (</w:t>
@@ -1588,23 +1572,7 @@
           <w:i/>
           <w:iCs/>
         </w:rPr>
-        <w:t xml:space="preserve">Cross-Site Request </w:t>
-      </w:r>
-      <w:proofErr w:type="spellStart"/>
-      <w:r>
-        <w:rPr>
-          <w:i/>
-          <w:iCs/>
-        </w:rPr>
-        <w:t>Forgery</w:t>
-      </w:r>
-      <w:proofErr w:type="spellEnd"/>
-      <w:r>
-        <w:rPr>
-          <w:i/>
-          <w:iCs/>
-        </w:rPr>
-        <w:t xml:space="preserve"> (CSRF) </w:t>
+        <w:t xml:space="preserve">Cross-Site Request Forgery (CSRF) </w:t>
       </w:r>
       <w:proofErr w:type="spellStart"/>
       <w:r>
@@ -4207,23 +4175,7 @@
           <w:i/>
           <w:iCs/>
         </w:rPr>
-        <w:t xml:space="preserve"> </w:t>
-      </w:r>
-      <w:proofErr w:type="spellStart"/>
-      <w:r>
-        <w:rPr>
-          <w:i/>
-          <w:iCs/>
-        </w:rPr>
-        <w:t>SameSite</w:t>
-      </w:r>
-      <w:proofErr w:type="spellEnd"/>
-      <w:r>
-        <w:rPr>
-          <w:i/>
-          <w:iCs/>
-        </w:rPr>
-        <w:t xml:space="preserve"> cookie </w:t>
+        <w:t xml:space="preserve"> SameSite cookie </w:t>
       </w:r>
       <w:proofErr w:type="spellStart"/>
       <w:r>
@@ -4260,9 +4212,40 @@
       <w:pPr>
         <w:pStyle w:val="bronnen"/>
       </w:pPr>
+      <w:r>
+        <w:rPr>
+          <w:i/>
+          <w:iCs/>
+        </w:rPr>
+        <w:t>Cross-Site Request Forgery Prevention - OWASP Cheat Sheet Series</w:t>
+      </w:r>
+      <w:r>
+        <w:t>. (</w:t>
+      </w:r>
+      <w:proofErr w:type="spellStart"/>
+      <w:r>
+        <w:t>n.d</w:t>
+      </w:r>
+      <w:proofErr w:type="spellEnd"/>
+      <w:r>
+        <w:t xml:space="preserve">.). </w:t>
+      </w:r>
+      <w:hyperlink r:id="rId64" w:history="1">
+        <w:r>
+          <w:rPr>
+            <w:rStyle w:val="Hyperlink"/>
+          </w:rPr>
+          <w:t>https://cheatsheetseries.owasp.org/cheatsheets/Cross-Site_Request_Forgery_Prevention_Cheat_Sheet.html</w:t>
+        </w:r>
+      </w:hyperlink>
+    </w:p>
+    <w:p>
+      <w:pPr>
+        <w:pStyle w:val="bronnen"/>
+      </w:pPr>
     </w:p>
     <w:sectPr>
-      <w:footerReference w:type="default" r:id="rId64"/>
+      <w:footerReference w:type="default" r:id="rId65"/>
       <w:pgSz w:w="11906" w:h="16838"/>
       <w:pgMar w:top="720" w:right="720" w:bottom="720" w:left="720" w:header="708" w:footer="708" w:gutter="0"/>
       <w:cols w:space="708"/>

</xml_diff>